<commit_message>
Add Arcus Housing PM internship to resume; drop Superdry and playground entries
Co-Authored-By: Claude Opus 5 <noreply@anthropic.com>
Claude-Session: https://claude.ai/code/session_017yrvCGio24u2z2DEZxnv4d
</commit_message>
<xml_diff>
--- a/career/resume/Sudhinee_Tridhip_Resume_2026-07.docx
+++ b/career/resume/Sudhinee_Tridhip_Resume_2026-07.docx
@@ -214,6 +214,89 @@
           <w:i w:val="0"/>
           <w:sz w:val="20"/>
         </w:rPr>
+        <w:t>Arcus Housing</w:t>
+      </w:r>
+      <w:r>
+        <w:rPr>
+          <w:b w:val="0"/>
+          <w:i w:val="0"/>
+          <w:sz w:val="20"/>
+        </w:rPr>
+        <w:t xml:space="preserve"> — San Francisco, CA</w:t>
+      </w:r>
+      <w:r>
+        <w:rPr>
+          <w:b w:val="0"/>
+          <w:i w:val="0"/>
+          <w:sz w:val="20"/>
+        </w:rPr>
+        <w:tab/>
+      </w:r>
+      <w:r>
+        <w:rPr>
+          <w:b w:val="0"/>
+          <w:i/>
+          <w:sz w:val="20"/>
+        </w:rPr>
+        <w:t>July – October 2026</w:t>
+      </w:r>
+    </w:p>
+    <w:p>
+      <w:pPr>
+        <w:spacing w:after="40" w:before="0"/>
+      </w:pPr>
+      <w:r>
+        <w:rPr>
+          <w:b w:val="0"/>
+          <w:i/>
+          <w:sz w:val="20"/>
+        </w:rPr>
+        <w:t>Project Manager Intern</w:t>
+      </w:r>
+    </w:p>
+    <w:p>
+      <w:pPr>
+        <w:pStyle w:val="ListBullet"/>
+        <w:spacing w:after="30" w:before="0"/>
+        <w:ind w:left="259" w:hanging="202"/>
+      </w:pPr>
+      <w:r>
+        <w:rPr>
+          <w:b w:val="0"/>
+          <w:i w:val="0"/>
+          <w:sz w:val="20"/>
+        </w:rPr>
+        <w:t>Run procurement for two active San Francisco construction projects — vendor sourcing, bid comparison, and tracking material and subcontractor commitments against budget.</w:t>
+      </w:r>
+    </w:p>
+    <w:p>
+      <w:pPr>
+        <w:pStyle w:val="ListBullet"/>
+        <w:spacing w:after="30" w:before="0"/>
+        <w:ind w:left="259" w:hanging="202"/>
+      </w:pPr>
+      <w:r>
+        <w:rPr>
+          <w:b w:val="0"/>
+          <w:i w:val="0"/>
+          <w:sz w:val="20"/>
+        </w:rPr>
+        <w:t>Handle procurement and vendor coordination for the firm’s San Francisco rental portfolio.</w:t>
+      </w:r>
+    </w:p>
+    <w:p>
+      <w:pPr>
+        <w:tabs>
+          <w:tab w:pos="10080" w:val="right"/>
+        </w:tabs>
+        <w:spacing w:after="20" w:before="80"/>
+      </w:pPr>
+      <w:r>
+        <w:rPr>
+          <w:b/>
+          <w:i w:val="0"/>
+          <w:sz w:val="20"/>
+        </w:rPr>
         <w:t>The Client Project Co., Ltd.</w:t>
       </w:r>
       <w:r>
@@ -316,74 +399,6 @@
     </w:p>
     <w:p>
       <w:pPr>
-        <w:tabs>
-          <w:tab w:pos="10080" w:val="right"/>
-        </w:tabs>
-        <w:spacing w:after="20" w:before="80"/>
-      </w:pPr>
-      <w:r>
-        <w:rPr>
-          <w:b/>
-          <w:i w:val="0"/>
-          <w:sz w:val="20"/>
-        </w:rPr>
-        <w:t>Superdry (Thailand) Co., Ltd.</w:t>
-      </w:r>
-      <w:r>
-        <w:rPr>
-          <w:b w:val="0"/>
-          <w:i w:val="0"/>
-          <w:sz w:val="20"/>
-        </w:rPr>
-        <w:t xml:space="preserve"> — Bangkok, Thailand</w:t>
-      </w:r>
-      <w:r>
-        <w:rPr>
-          <w:b w:val="0"/>
-          <w:i w:val="0"/>
-          <w:sz w:val="20"/>
-        </w:rPr>
-        <w:tab/>
-      </w:r>
-      <w:r>
-        <w:rPr>
-          <w:b w:val="0"/>
-          <w:i/>
-          <w:sz w:val="20"/>
-        </w:rPr>
-        <w:t>July – December 2023</w:t>
-      </w:r>
-    </w:p>
-    <w:p>
-      <w:pPr>
-        <w:spacing w:after="40" w:before="0"/>
-      </w:pPr>
-      <w:r>
-        <w:rPr>
-          <w:b w:val="0"/>
-          <w:i/>
-          <w:sz w:val="20"/>
-        </w:rPr>
-        <w:t>Graphic Designer</w:t>
-      </w:r>
-    </w:p>
-    <w:p>
-      <w:pPr>
-        <w:pStyle w:val="ListBullet"/>
-        <w:spacing w:after="30" w:before="0"/>
-        <w:ind w:left="259" w:hanging="202"/>
-      </w:pPr>
-      <w:r>
-        <w:rPr>
-          <w:b w:val="0"/>
-          <w:i w:val="0"/>
-          <w:sz w:val="20"/>
-        </w:rPr>
-        <w:t>High-volume campaign artwork across social, digital, and pop-up retail; +32% online engagement.</w:t>
-      </w:r>
-    </w:p>
-    <w:p>
-      <w:pPr>
         <w:keepNext/>
         <w:pBdr>
           <w:bottom w:val="single" w:sz="6" w:space="1" w:color="1F3A5F"/>
@@ -453,7 +468,7 @@
           <w:i w:val="0"/>
           <w:sz w:val="20"/>
         </w:rPr>
-        <w:t>Ran feasibility, zoning, and density-bonus analysis on a 2.6-acre Safeway site, using state streamlining rather than a discretionary rezoning to hold a compliant 8-story midrise and remove years of entitlement risk.</w:t>
+        <w:t>Ran feasibility, zoning, and density-bonus analysis on a 2.6-acre Safeway site, using state streamlining rather than a discretionary rezoning to hold a compliant 8-story midrise.</w:t>
       </w:r>
     </w:p>
     <w:p>
@@ -523,7 +538,7 @@
           <w:i w:val="0"/>
           <w:sz w:val="20"/>
         </w:rPr>
-        <w:t>Directed development strategy and underwriting for a 3-phase, 332,805 SF mixed-use project with $680M total development value, projecting a 26.45% levered IRR and 1.92x equity multiple.</w:t>
+        <w:t>Directed strategy and underwriting for a 3-phase, 332,805 SF mixed-use project ($680M TDV), projecting a 26.45% levered IRR and 1.92x equity multiple.</w:t>
       </w:r>
     </w:p>
     <w:p>
@@ -648,7 +663,7 @@
           <w:i w:val="0"/>
           <w:sz w:val="20"/>
         </w:rPr>
-        <w:t>Maintain a live screening tool for 18 Bangkok land parcels — price per sq.wah, parcel geometry from title surveys, transit access, catchment spending power, competing supply — plus an investor brief pricing four corridor strategies.</w:t>
+        <w:t>Maintain a live screening tool for 18 Bangkok land parcels — price per sq.wah, parcel geometry, transit access, catchment spending power — plus an investor brief on four corridor strategies.</w:t>
       </w:r>
     </w:p>
     <w:p>
@@ -691,29 +706,6 @@
           <w:sz w:val="20"/>
         </w:rPr>
         <w:t xml:space="preserve"> — RE-CU Junior: Start-Up in Real Estate, Bangkok (2023)</w:t>
-      </w:r>
-    </w:p>
-    <w:p>
-      <w:pPr>
-        <w:pStyle w:val="ListBullet"/>
-        <w:spacing w:after="30" w:before="0"/>
-        <w:ind w:left="259" w:hanging="202"/>
-      </w:pPr>
-      <w:r>
-        <w:rPr>
-          <w:b/>
-          <w:i w:val="0"/>
-          <w:sz w:val="20"/>
-        </w:rPr>
-        <w:t>Project Manager</w:t>
-      </w:r>
-      <w:r>
-        <w:rPr>
-          <w:b w:val="0"/>
-          <w:i w:val="0"/>
-          <w:sz w:val="20"/>
-        </w:rPr>
-        <w:t>, Community Creative Playground — built playground for 110 students (2022)</w:t>
       </w:r>
     </w:p>
     <w:p>
@@ -776,7 +768,7 @@
           <w:i w:val="0"/>
           <w:sz w:val="20"/>
         </w:rPr>
-        <w:t>cash-flow modeling, underwriting, highest-and-best-use analysis, market feasibility, due diligence, entitlement and zoning strategy, density bonus, leasing strategy, stakeholder management</w:t>
+        <w:t>cash-flow modeling, underwriting, highest-and-best-use analysis, market feasibility, due diligence, entitlement and zoning strategy, density bonus, procurement</w:t>
       </w:r>
     </w:p>
     <w:p>

</xml_diff>